<commit_message>
Refine 4/19 materials with accurate sermon transcript
Corrected Greek word (suneodokeo), added exact quotes from
Pastor Steve's written transcript, and improved accuracy of
sermon details throughout all materials.

Co-Authored-By: Claude Opus 4.6 (1M context) <noreply@anthropic.com>
</commit_message>
<xml_diff>
--- a/ECC Sunday School - The Power to Scatter (Middle School).docx
+++ b/ECC Sunday School - The Power to Scatter (Middle School).docx
@@ -729,7 +729,7 @@
     <w:p>
       <w:pPr/>
       <w:r>
-        <w:t>Then persecution hit. Saul — who the Greek text says was "pleased with" Stephen’s murder — started going house to house, dragging off men and women. The word "ravaging" in Greek carries two images: an army destroying a city and a wild animal tearing at its meat. That’s how vicious this was.</w:t>
+        <w:t>Then persecution hit. Saul — who the Greek text says was "pleased with" (suneodokeo) Stephen’s murder — started entering houses and synagogues, dragging off men and women. He had believers beaten and imprisoned. If they renounced their faith in Jesus they’d be set free; if they didn’t recant, they’d be killed. The word "ravaging" in Greek — from commentaries — refers to an army destroying a city or a wild animal tearing at its meat. That’s how vicious this was.</w:t>
       </w:r>
     </w:p>
     <w:p>
@@ -766,7 +766,7 @@
     <w:p>
       <w:pPr/>
       <w:r>
-        <w:t>Here’s the surprising detail in verse 1: "they were all scattered... except the apostles." The apostles — the trained leaders, the inner circle who followed Jesus — stayed in Jerusalem. The people who scattered and preached the word were ordinary believers. Students, teachers, cooks, regular people. Not the trained preachers.</w:t>
+        <w:t>Pastor Steve called verse 4 "revolutionary." Here’s the surprising detail in verse 1: "they were all scattered... except the apostles." The apostles stayed in Jerusalem. The scattered ones were the believers — the laity, not the clergy. As Pastor Steve said: "Sometimes we think sharing the Gospel is for pastors, missionaries, or people who are more qualified. But here it reminds us that mission belongs to all of us."</w:t>
       </w:r>
     </w:p>
     <w:p>
@@ -779,7 +779,7 @@
         <w:rPr>
           <w:i/>
         </w:rPr>
-        <w:t>Philip is the star of this chapter. Pastor Steve had fun with this — he showed pictures of famous "Phils" (Dr. Phil, Phil Jackson the basketball coach, Uncle Phil from Fresh Prince) before revealing the real Philip. He wasn’t an apostle or a theologian. He was one of the seven deacons chosen in Acts 6 to serve food to widows. Pastor Steve put it bluntly: "In essence, he was a waiter."</w:t>
+        <w:t>Philip is the star of this chapter. Pastor Steve had fun with this — he showed pictures of famous "Phils" (Dr. Phil, Phil Jackson the basketball coach, Uncle Phil from Fresh Prince) before revealing the real Philip. He wasn’t an apostle or a theologian. He was one of the deacons raised up with Stephen in Acts 6 — they served the widows and cared for the followers. Pastor Steve put it bluntly: "He was a waiter. Just a normal guy. Who became an evangelist."</w:t>
       </w:r>
     </w:p>
     <w:p>
@@ -799,7 +799,7 @@
     <w:p>
       <w:pPr/>
       <w:r>
-        <w:t>How did they do it? Not by their own power. 2 Timothy 1:7 says: "For God gave us a spirit not of fear but of power and of love and self-discipline." The Holy Spirit compelled them.</w:t>
+        <w:t>How did they do it? Not out of their own power but the extraordinary power of the Holy Spirit. 2 Timothy 1:7 (NIV): "For God gave us a spirit not of fear but of power and love and self-discipline."</w:t>
       </w:r>
     </w:p>
     <w:p>
@@ -809,7 +809,7 @@
     <w:p>
       <w:pPr/>
       <w:r>
-        <w:t>Pastor Steve also drew a parallel to the COVID-19 pandemic (2020-2022): churches were forcibly closed, believers scattered to living rooms and Zoom screens. There was a surge in digital missions and neighborhood care. The word was taken out of the temples and into the streets — just like Acts 8. Hundreds of people still tune in to ECC’s messages online because of that scattering.</w:t>
+        <w:t>Pastor Steve also drew a parallel to the COVID-19 pandemic (2020-2022): when church buildings were forcibly closed, the church was "scattered" to living rooms and Zoom screens. There was a surge in digital missions and localized neighborhood care that hadn’t happened in decades. The "scattering" forced the Word out of the "temple" and into the street — just like Acts 8.</w:t>
       </w:r>
     </w:p>
     <w:p>
@@ -836,7 +836,7 @@
     <w:p>
       <w:pPr/>
       <w:r>
-        <w:t>Look at how the passage ends: "So there was much joy in that city" (v. 8). Pastor Steve emphasized that this joy was not private or quiet — it was overflowing, communal, and visible.</w:t>
+        <w:t>Look at how the passage ends: "So there was much joy in that city" (v. 8). Pastor Steve described it powerfully: "Much joy. Not private. Not quiet. Overflowing. Probably communal. Visible."</w:t>
       </w:r>
     </w:p>
     <w:p>
@@ -859,7 +859,7 @@
         <w:rPr>
           <w:i/>
         </w:rPr>
-        <w:t>Pastor Steve said: "The gospel message doesn’t just fix problems — it restores joy to all the communities." When God’s kingdom breaks in, it’s a shared, collective restoration.</w:t>
+        <w:t>Pastor Steve said: "The Gospel doesn’t just fix problems — it restores joy. When God’s kingdom breaks in, it’s a shared collective restoration." People listened. Chains were broken. The sick were healed. Lives restored.</w:t>
       </w:r>
     </w:p>
     <w:p>

</xml_diff>